<commit_message>
Sync Lab Templates with v2.1.1 release: version boxes, engagement-team row, process note
- Set the 'Specification Version' box to v2.1.1 in all eight Lab Templates
  (MASA Android/iOS, CASA, Cloud App and Config — Compliance Report and
  Developer Test Report), replacing the stale v2.0/v1.0 values so the
  templates match the specs stamped in this release. (#330)
- Add an 'Engagement team members' row to the front-page table of all eight
  templates so the CB can verify tester qualifications per the ADA scope. (#206)
- CONTRIBUTING.md: add a Stage 3 step and extend the Document versioning
  section requiring the Lab Template version boxes to be bumped alongside the
  spec version stamps on every release.
- CHANGELOG.md: record the above under [2.1.1].

Resolves #330
Resolves #206
</commit_message>
<xml_diff>
--- a/Submission Forms and Templates/Lab Templates/CASA Compliance Report.docx
+++ b/Submission Forms and Templates/Lab Templates/CASA Compliance Report.docx
@@ -150,15 +150,7 @@
                 <w:sz w:val="42"/>
                 <w:szCs w:val="42"/>
               </w:rPr>
-              <w:t>CASA</w:t>
-            </w:r>
-            <w:r>
-              <w:rPr>
-                <w:color w:val="FFFFFF"/>
-                <w:sz w:val="42"/>
-                <w:szCs w:val="42"/>
-              </w:rPr>
-              <w:t xml:space="preserve"> Compliance Report</w:t>
+              <w:t>CASA Compliance Report</w:t>
             </w:r>
           </w:p>
           <w:p>
@@ -406,10 +398,7 @@
               <w:ind w:left="180"/>
             </w:pPr>
             <w:r>
-              <w:t>CASA</w:t>
-            </w:r>
-            <w:r>
-              <w:t xml:space="preserve"> Specification Version</w:t>
+              <w:t>CASA Specification Version</w:t>
             </w:r>
           </w:p>
         </w:tc>
@@ -437,13 +426,7 @@
               <w:spacing w:line="240" w:lineRule="auto"/>
             </w:pPr>
             <w:r>
-              <w:t>v</w:t>
-            </w:r>
-            <w:r>
-              <w:t>2</w:t>
-            </w:r>
-            <w:r>
-              <w:t>.0</w:t>
+              <w:t xml:space="preserve">v2.1.1</w:t>
             </w:r>
           </w:p>
         </w:tc>
@@ -589,6 +572,93 @@
             <w:r>
               <w:t>(IN COMPLIANCE, REMEDIATION REQUIRED)</w:t>
             </w:r>
+          </w:p>
+        </w:tc>
+      </w:tr>
+      <w:tr>
+        <w:trPr>
+          <w:trHeight w:val="420"/>
+          <w:jc w:val="center"/>
+        </w:trPr>
+        <w:tc>
+          <w:tcPr>
+            <w:tcW w:w="5145" w:type="dxa"/>
+            <w:tcMar>
+              <w:top w:w="100" w:type="dxa"/>
+              <w:left w:w="100" w:type="dxa"/>
+              <w:bottom w:w="100" w:type="dxa"/>
+              <w:right w:w="100" w:type="dxa"/>
+            </w:tcMar>
+          </w:tcPr>
+          <w:p>
+            <w:pPr>
+              <w:widowControl w:val="0"/>
+              <w:pBdr>
+                <w:top w:val="nil"/>
+                <w:left w:val="nil"/>
+                <w:bottom w:val="nil"/>
+                <w:right w:val="nil"/>
+                <w:between w:val="nil"/>
+              </w:pBdr>
+              <w:spacing w:line="240" w:lineRule="auto"/>
+              <w:ind w:left="180"/>
+            </w:pPr>
+          </w:p>
+          <w:p>
+            <w:pPr>
+              <w:widowControl w:val="0"/>
+              <w:pBdr>
+                <w:top w:val="nil"/>
+                <w:left w:val="nil"/>
+                <w:bottom w:val="nil"/>
+                <w:right w:val="nil"/>
+                <w:between w:val="nil"/>
+              </w:pBdr>
+              <w:spacing w:line="240" w:lineRule="auto"/>
+              <w:ind w:left="180"/>
+            </w:pPr>
+            <w:r>
+              <w:t>Engagement team members</w:t>
+            </w:r>
+          </w:p>
+          <w:p>
+            <w:pPr>
+              <w:widowControl w:val="0"/>
+              <w:pBdr>
+                <w:top w:val="nil"/>
+                <w:left w:val="nil"/>
+                <w:bottom w:val="nil"/>
+                <w:right w:val="nil"/>
+                <w:between w:val="nil"/>
+              </w:pBdr>
+              <w:spacing w:line="240" w:lineRule="auto"/>
+              <w:ind w:left="180"/>
+            </w:pPr>
+          </w:p>
+        </w:tc>
+        <w:tc>
+          <w:tcPr>
+            <w:tcW w:w="5250" w:type="dxa"/>
+            <w:shd w:val="clear" w:color="auto" w:fill="EFEFEF"/>
+            <w:tcMar>
+              <w:top w:w="100" w:type="dxa"/>
+              <w:left w:w="100" w:type="dxa"/>
+              <w:bottom w:w="100" w:type="dxa"/>
+              <w:right w:w="100" w:type="dxa"/>
+            </w:tcMar>
+          </w:tcPr>
+          <w:p>
+            <w:pPr>
+              <w:widowControl w:val="0"/>
+              <w:pBdr>
+                <w:top w:val="nil"/>
+                <w:left w:val="nil"/>
+                <w:bottom w:val="nil"/>
+                <w:right w:val="nil"/>
+                <w:between w:val="nil"/>
+              </w:pBdr>
+              <w:spacing w:line="240" w:lineRule="auto"/>
+            </w:pPr>
           </w:p>
         </w:tc>
       </w:tr>
@@ -5318,7 +5388,16 @@
                 <w:bCs/>
                 <w:color w:val="FFFFFF"/>
               </w:rPr>
-              <w:t>Onboarding Questionnaire Filename and Hash</w:t>
+              <w:t xml:space="preserve">Onboarding Questionnaire </w:t>
+            </w:r>
+            <w:r>
+              <w:rPr>
+                <w:b/>
+                <w:bCs/>
+                <w:color w:val="FFFFFF"/>
+              </w:rPr>
+              <w:lastRenderedPageBreak/>
+              <w:t>Filename and Hash</w:t>
             </w:r>
           </w:p>
         </w:tc>
@@ -5935,6 +6014,7 @@
       <w:bookmarkStart w:id="4" w:name="_p602if8t98qk" w:colFirst="0" w:colLast="0"/>
       <w:bookmarkEnd w:id="4"/>
       <w:r>
+        <w:lastRenderedPageBreak/>
         <w:t>Remarks and Comments</w:t>
       </w:r>
     </w:p>

</xml_diff>